<commit_message>
Phien 23: cap nhat CLAUDE.md + Huong_Dan_Toan_Dien_CRM (them Phan 9 deploy cloud)
</commit_message>
<xml_diff>
--- a/Huong_Dan_Toan_Dien_CRM.docx
+++ b/Huong_Dan_Toan_Dien_CRM.docx
@@ -3416,6 +3416,935 @@
         <w:t>Khi có thay đổi quan trọng trong hệ thống, chạy lại script _make_guide_pdf.py để tạo phiên bản mới.</w:t>
       </w:r>
     </w:p>
+    <w:p>
+      <w:r>
+        <w:br w:type="page"/>
+      </w:r>
+    </w:p>
+    <w:p>
+      <w:pPr>
+        <w:pStyle w:val="Heading1"/>
+      </w:pPr>
+      <w:r>
+        <w:rPr>
+          <w:color w:val="0D47A1"/>
+        </w:rPr>
+        <w:t>PHẦN 9: PHIÊN 22-23 — BẢO MẬT, DASHBOARD WEB &amp; DEPLOY CLOUD</w:t>
+      </w:r>
+    </w:p>
+    <w:p>
+      <w:r>
+        <w:rPr>
+          <w:b w:val="0"/>
+          <w:sz w:val="22"/>
+        </w:rPr>
+        <w:t>Phần này ghi lại các tính năng và quy tắc được bổ sung từ phiên 22-23.</w:t>
+      </w:r>
+    </w:p>
+    <w:p>
+      <w:pPr>
+        <w:pStyle w:val="Heading2"/>
+      </w:pPr>
+      <w:r>
+        <w:rPr>
+          <w:color w:val="0D47A1"/>
+        </w:rPr>
+        <w:t>9.1  Web Dashboard CRM (dashboard.py)</w:t>
+      </w:r>
+    </w:p>
+    <w:p>
+      <w:r>
+        <w:rPr>
+          <w:b/>
+          <w:sz w:val="22"/>
+        </w:rPr>
+        <w:t>Tính năng:</w:t>
+      </w:r>
+    </w:p>
+    <w:p>
+      <w:pPr>
+        <w:pStyle w:val="ListBullet"/>
+      </w:pPr>
+      <w:r>
+        <w:rPr>
+          <w:sz w:val="20"/>
+        </w:rPr>
+        <w:t>Tab 1 — Báo cáo &amp; Tổng quan: KPI cards, phễu Plotly, leaderboard, cảnh báo quá hạn</w:t>
+      </w:r>
+    </w:p>
+    <w:p>
+      <w:pPr>
+        <w:pStyle w:val="ListBullet"/>
+      </w:pPr>
+      <w:r>
+        <w:rPr>
+          <w:sz w:val="20"/>
+        </w:rPr>
+        <w:t>Tab 2 — Danh sách Leads CRM: lọc nâng cao, tìm kiếm, chỉnh sửa thời gian thực</w:t>
+      </w:r>
+    </w:p>
+    <w:p>
+      <w:pPr>
+        <w:pStyle w:val="ListBullet"/>
+      </w:pPr>
+      <w:r>
+        <w:rPr>
+          <w:sz w:val="20"/>
+        </w:rPr>
+        <w:t>Tab 3 — Số Mới Chờ Duyệt (Staging): xem + duyệt leads từ marketing</w:t>
+      </w:r>
+    </w:p>
+    <w:p>
+      <w:pPr>
+        <w:pStyle w:val="ListBullet"/>
+      </w:pPr>
+      <w:r>
+        <w:rPr>
+          <w:sz w:val="20"/>
+        </w:rPr>
+        <w:t>Tab 4 — Nhập Số Hàng Loạt &amp; Chia Sale: nhập thô Tên-SĐT, tự lọc trùng</w:t>
+      </w:r>
+    </w:p>
+    <w:p>
+      <w:pPr>
+        <w:pStyle w:val="ListBullet"/>
+      </w:pPr>
+      <w:r>
+        <w:rPr>
+          <w:sz w:val="20"/>
+        </w:rPr>
+        <w:t>Tab 5 — Quản lý Team &amp; Cấu hình: sale roster, ngưỡng nhắc nhở, chuyển leads</w:t>
+      </w:r>
+    </w:p>
+    <w:p>
+      <w:r>
+        <w:rPr>
+          <w:b/>
+          <w:sz w:val="22"/>
+        </w:rPr>
+        <w:t>Cách chạy local:</w:t>
+      </w:r>
+    </w:p>
+    <w:p>
+      <w:r>
+        <w:rPr>
+          <w:rFonts w:ascii="Courier New" w:hAnsi="Courier New"/>
+          <w:sz w:val="18"/>
+        </w:rPr>
+        <w:t>python3.13 -m streamlit run dashboard.py</w:t>
+        <w:br/>
+        <w:t>Hoặc double-click: Mo Dashboard.bat</w:t>
+        <w:br/>
+        <w:t>Hoặc shortcut Desktop: Mo CRM Kha Son.bat</w:t>
+      </w:r>
+    </w:p>
+    <w:p>
+      <w:pPr>
+        <w:pStyle w:val="Heading2"/>
+      </w:pPr>
+      <w:r>
+        <w:rPr>
+          <w:color w:val="0D47A1"/>
+        </w:rPr>
+        <w:t>9.2  Deploy lên Streamlit Community Cloud</w:t>
+      </w:r>
+    </w:p>
+    <w:p>
+      <w:r>
+        <w:rPr>
+          <w:b/>
+          <w:sz w:val="22"/>
+        </w:rPr>
+        <w:t>URL app: https://kha-son-crm-k3tfrnb488ckvq4nb5xsm7.streamlit.app</w:t>
+      </w:r>
+    </w:p>
+    <w:p>
+      <w:r>
+        <w:rPr>
+          <w:b w:val="0"/>
+          <w:sz w:val="22"/>
+        </w:rPr>
+        <w:t>GitHub repo: https://github.com/mhien588-arch/kha-son-crm (public)</w:t>
+      </w:r>
+    </w:p>
+    <w:tbl>
+      <w:tblPr>
+        <w:tblStyle w:val="TableGrid"/>
+        <w:tblW w:type="auto" w:w="0"/>
+        <w:tblLook w:firstColumn="1" w:firstRow="1" w:lastColumn="0" w:lastRow="0" w:noHBand="0" w:noVBand="1" w:val="04A0"/>
+      </w:tblPr>
+      <w:tblGrid>
+        <w:gridCol w:w="4703"/>
+        <w:gridCol w:w="4703"/>
+      </w:tblGrid>
+      <w:tr>
+        <w:tc>
+          <w:tcPr>
+            <w:tcW w:type="dxa" w:w="4703"/>
+          </w:tcPr>
+          <w:p>
+            <w:r>
+              <w:rPr>
+                <w:b/>
+              </w:rPr>
+              <w:t>Hạng mục</w:t>
+            </w:r>
+          </w:p>
+        </w:tc>
+        <w:tc>
+          <w:tcPr>
+            <w:tcW w:type="dxa" w:w="4703"/>
+          </w:tcPr>
+          <w:p>
+            <w:r>
+              <w:rPr>
+                <w:b/>
+              </w:rPr>
+              <w:t>Chi tiết</w:t>
+            </w:r>
+          </w:p>
+        </w:tc>
+      </w:tr>
+      <w:tr>
+        <w:tc>
+          <w:tcPr>
+            <w:tcW w:type="dxa" w:w="4703"/>
+          </w:tcPr>
+          <w:p>
+            <w:r>
+              <w:t>Hosting</w:t>
+            </w:r>
+          </w:p>
+        </w:tc>
+        <w:tc>
+          <w:tcPr>
+            <w:tcW w:type="dxa" w:w="4703"/>
+          </w:tcPr>
+          <w:p>
+            <w:r>
+              <w:t>Streamlit Community Cloud (miễn phí)</w:t>
+            </w:r>
+          </w:p>
+        </w:tc>
+      </w:tr>
+      <w:tr>
+        <w:tc>
+          <w:tcPr>
+            <w:tcW w:type="dxa" w:w="4703"/>
+          </w:tcPr>
+          <w:p>
+            <w:r>
+              <w:t>Nguồn code</w:t>
+            </w:r>
+          </w:p>
+        </w:tc>
+        <w:tc>
+          <w:tcPr>
+            <w:tcW w:type="dxa" w:w="4703"/>
+          </w:tcPr>
+          <w:p>
+            <w:r>
+              <w:t>GitHub repo kha-son-crm, branch main</w:t>
+            </w:r>
+          </w:p>
+        </w:tc>
+      </w:tr>
+      <w:tr>
+        <w:tc>
+          <w:tcPr>
+            <w:tcW w:type="dxa" w:w="4703"/>
+          </w:tcPr>
+          <w:p>
+            <w:r>
+              <w:t>Credentials</w:t>
+            </w:r>
+          </w:p>
+        </w:tc>
+        <w:tc>
+          <w:tcPr>
+            <w:tcW w:type="dxa" w:w="4703"/>
+          </w:tcPr>
+          <w:p>
+            <w:r>
+              <w:t>Lưu trong Streamlit Cloud Secrets — KHÔNG trong code</w:t>
+            </w:r>
+          </w:p>
+        </w:tc>
+      </w:tr>
+      <w:tr>
+        <w:tc>
+          <w:tcPr>
+            <w:tcW w:type="dxa" w:w="4703"/>
+          </w:tcPr>
+          <w:p>
+            <w:r>
+              <w:t>Auto-deploy</w:t>
+            </w:r>
+          </w:p>
+        </w:tc>
+        <w:tc>
+          <w:tcPr>
+            <w:tcW w:type="dxa" w:w="4703"/>
+          </w:tcPr>
+          <w:p>
+            <w:r>
+              <w:t>Mỗi khi push lên GitHub, Streamlit Cloud tự cập nhật ~2 phút</w:t>
+            </w:r>
+          </w:p>
+        </w:tc>
+      </w:tr>
+      <w:tr>
+        <w:tc>
+          <w:tcPr>
+            <w:tcW w:type="dxa" w:w="4703"/>
+          </w:tcPr>
+          <w:p>
+            <w:r>
+              <w:t>App ngủ</w:t>
+            </w:r>
+          </w:p>
+        </w:tc>
+        <w:tc>
+          <w:tcPr>
+            <w:tcW w:type="dxa" w:w="4703"/>
+          </w:tcPr>
+          <w:p>
+            <w:r>
+              <w:t>Sau 7 ngày không dùng → lần mở đầu chậm ~30s, tự thức dậy</w:t>
+            </w:r>
+          </w:p>
+        </w:tc>
+      </w:tr>
+      <w:tr>
+        <w:tc>
+          <w:tcPr>
+            <w:tcW w:type="dxa" w:w="4703"/>
+          </w:tcPr>
+          <w:p>
+            <w:r>
+              <w:t>Filesystem</w:t>
+            </w:r>
+          </w:p>
+        </w:tc>
+        <w:tc>
+          <w:tcPr>
+            <w:tcW w:type="dxa" w:w="4703"/>
+          </w:tcPr>
+          <w:p>
+            <w:r>
+              <w:t>Không persistent — backup CSV chỉ chạy trên máy tính</w:t>
+            </w:r>
+          </w:p>
+        </w:tc>
+      </w:tr>
+      <w:tr>
+        <w:tc>
+          <w:tcPr>
+            <w:tcW w:type="dxa" w:w="4703"/>
+          </w:tcPr>
+          <w:p>
+            <w:r>
+              <w:t>Tên app icon</w:t>
+            </w:r>
+          </w:p>
+        </w:tc>
+        <w:tc>
+          <w:tcPr>
+            <w:tcW w:type="dxa" w:w="4703"/>
+          </w:tcPr>
+          <w:p>
+            <w:r>
+              <w:t>CRM BKD2 (page_title trong dashboard.py)</w:t>
+            </w:r>
+          </w:p>
+        </w:tc>
+      </w:tr>
+    </w:tbl>
+    <w:p>
+      <w:pPr>
+        <w:pStyle w:val="Heading2"/>
+      </w:pPr>
+      <w:r>
+        <w:rPr>
+          <w:color w:val="0D47A1"/>
+        </w:rPr>
+        <w:t>9.3  Thêm App Vào Màn Hình Chính Điện Thoại</w:t>
+      </w:r>
+    </w:p>
+    <w:tbl>
+      <w:tblPr>
+        <w:tblStyle w:val="TableGrid"/>
+        <w:tblW w:type="auto" w:w="0"/>
+        <w:tblLook w:firstColumn="1" w:firstRow="1" w:lastColumn="0" w:lastRow="0" w:noHBand="0" w:noVBand="1" w:val="04A0"/>
+      </w:tblPr>
+      <w:tblGrid>
+        <w:gridCol w:w="4703"/>
+        <w:gridCol w:w="4703"/>
+      </w:tblGrid>
+      <w:tr>
+        <w:tc>
+          <w:tcPr>
+            <w:tcW w:type="dxa" w:w="4703"/>
+          </w:tcPr>
+          <w:p>
+            <w:r>
+              <w:rPr>
+                <w:b/>
+              </w:rPr>
+              <w:t>Hệ điều hành</w:t>
+            </w:r>
+          </w:p>
+        </w:tc>
+        <w:tc>
+          <w:tcPr>
+            <w:tcW w:type="dxa" w:w="4703"/>
+          </w:tcPr>
+          <w:p>
+            <w:r>
+              <w:rPr>
+                <w:b/>
+              </w:rPr>
+              <w:t>Hướng dẫn</w:t>
+            </w:r>
+          </w:p>
+        </w:tc>
+      </w:tr>
+      <w:tr>
+        <w:tc>
+          <w:tcPr>
+            <w:tcW w:type="dxa" w:w="4703"/>
+          </w:tcPr>
+          <w:p>
+            <w:r>
+              <w:t>Android</w:t>
+            </w:r>
+          </w:p>
+        </w:tc>
+        <w:tc>
+          <w:tcPr>
+            <w:tcW w:type="dxa" w:w="4703"/>
+          </w:tcPr>
+          <w:p>
+            <w:r>
+              <w:t>Mở Chrome → nhập URL → Menu 3 chấm (⋮) → 'Thêm vào màn hình chính'</w:t>
+            </w:r>
+          </w:p>
+        </w:tc>
+      </w:tr>
+      <w:tr>
+        <w:tc>
+          <w:tcPr>
+            <w:tcW w:type="dxa" w:w="4703"/>
+          </w:tcPr>
+          <w:p>
+            <w:r>
+              <w:t>iPhone / iPad</w:t>
+            </w:r>
+          </w:p>
+        </w:tc>
+        <w:tc>
+          <w:tcPr>
+            <w:tcW w:type="dxa" w:w="4703"/>
+          </w:tcPr>
+          <w:p>
+            <w:r>
+              <w:t>⚠ PHẢI dùng Safari (không phải Chrome)</w:t>
+              <w:br/>
+              <w:t>Mở Safari → nhập URL → nút Share (↑) → 'Thêm vào màn hình chính'</w:t>
+            </w:r>
+          </w:p>
+        </w:tc>
+      </w:tr>
+    </w:tbl>
+    <w:p>
+      <w:r>
+        <w:rPr>
+          <w:color w:val="C62828"/>
+          <w:sz w:val="20"/>
+        </w:rPr>
+        <w:t>⚠ LƯU Ý QUAN TRỌNG: Chrome trên iPhone không có tính năng 'Thêm vào màn hình chính' — đây là giới hạn của Apple/Chrome iOS, không phải lỗi. Bắt buộc phải dùng Safari.</w:t>
+      </w:r>
+    </w:p>
+    <w:p>
+      <w:pPr>
+        <w:pStyle w:val="Heading2"/>
+      </w:pPr>
+      <w:r>
+        <w:rPr>
+          <w:color w:val="0D47A1"/>
+        </w:rPr>
+        <w:t>9.4  Bảo Mật &amp; Gitignore</w:t>
+      </w:r>
+    </w:p>
+    <w:p>
+      <w:r>
+        <w:rPr>
+          <w:b/>
+          <w:sz w:val="22"/>
+        </w:rPr>
+        <w:t>Các file KHÔNG BAO GIỜ được commit lên GitHub:</w:t>
+      </w:r>
+    </w:p>
+    <w:p>
+      <w:pPr>
+        <w:pStyle w:val="ListBullet"/>
+      </w:pPr>
+      <w:r>
+        <w:rPr>
+          <w:sz w:val="20"/>
+        </w:rPr>
+        <w:t>data/google_creds.json — Service Account key (credentials gốc)</w:t>
+      </w:r>
+    </w:p>
+    <w:p>
+      <w:pPr>
+        <w:pStyle w:val="ListBullet"/>
+      </w:pPr>
+      <w:r>
+        <w:rPr>
+          <w:sz w:val="20"/>
+        </w:rPr>
+        <w:t>.streamlit/secrets.toml — credentials dạng TOML cho Streamlit local</w:t>
+      </w:r>
+    </w:p>
+    <w:p>
+      <w:pPr>
+        <w:pStyle w:val="ListBullet"/>
+      </w:pPr>
+      <w:r>
+        <w:rPr>
+          <w:sz w:val="20"/>
+        </w:rPr>
+        <w:t>data/backups/ — bản sao lưu CSV hàng ngày</w:t>
+      </w:r>
+    </w:p>
+    <w:p>
+      <w:pPr>
+        <w:pStyle w:val="ListBullet"/>
+      </w:pPr>
+      <w:r>
+        <w:rPr>
+          <w:sz w:val="20"/>
+        </w:rPr>
+        <w:t>config.json — KHÔNG gitignore (cloud cần file này để đọc cấu hình team)</w:t>
+      </w:r>
+    </w:p>
+    <w:p>
+      <w:pPr>
+        <w:pStyle w:val="Heading2"/>
+      </w:pPr>
+      <w:r>
+        <w:rPr>
+          <w:color w:val="0D47A1"/>
+        </w:rPr>
+        <w:t>9.5  Quy Tắc Bất Biến (Phiên 22-23)</w:t>
+      </w:r>
+    </w:p>
+    <w:tbl>
+      <w:tblPr>
+        <w:tblStyle w:val="TableGrid"/>
+        <w:tblW w:type="auto" w:w="0"/>
+        <w:tblLook w:firstColumn="1" w:firstRow="1" w:lastColumn="0" w:lastRow="0" w:noHBand="0" w:noVBand="1" w:val="04A0"/>
+      </w:tblPr>
+      <w:tblGrid>
+        <w:gridCol w:w="4703"/>
+        <w:gridCol w:w="4703"/>
+      </w:tblGrid>
+      <w:tr>
+        <w:tc>
+          <w:tcPr>
+            <w:tcW w:type="dxa" w:w="4703"/>
+          </w:tcPr>
+          <w:p>
+            <w:r>
+              <w:rPr>
+                <w:b/>
+              </w:rPr>
+              <w:t>Quy tắc</w:t>
+            </w:r>
+          </w:p>
+        </w:tc>
+        <w:tc>
+          <w:tcPr>
+            <w:tcW w:type="dxa" w:w="4703"/>
+          </w:tcPr>
+          <w:p>
+            <w:r>
+              <w:rPr>
+                <w:b/>
+              </w:rPr>
+              <w:t>Giải thích</w:t>
+            </w:r>
+          </w:p>
+        </w:tc>
+      </w:tr>
+      <w:tr>
+        <w:tc>
+          <w:tcPr>
+            <w:tcW w:type="dxa" w:w="4703"/>
+          </w:tcPr>
+          <w:p>
+            <w:r>
+              <w:t>RAW cho SĐT</w:t>
+            </w:r>
+          </w:p>
+        </w:tc>
+        <w:tc>
+          <w:tcPr>
+            <w:tcW w:type="dxa" w:w="4703"/>
+          </w:tcPr>
+          <w:p>
+            <w:r>
+              <w:t>Mọi thao tác ghi/cập nhật SĐT lên Google Sheets phải dùng value_input_option='RAW'. Nếu dùng USER_ENTERED, Sheets tự chuyển '0978...' thành số học → mất số 0 đầu.</w:t>
+            </w:r>
+          </w:p>
+        </w:tc>
+      </w:tr>
+      <w:tr>
+        <w:tc>
+          <w:tcPr>
+            <w:tcW w:type="dxa" w:w="4703"/>
+          </w:tcPr>
+          <w:p>
+            <w:r>
+              <w:t>clean_html() cho Streamlit</w:t>
+            </w:r>
+          </w:p>
+        </w:tc>
+        <w:tc>
+          <w:tcPr>
+            <w:tcW w:type="dxa" w:w="4703"/>
+          </w:tcPr>
+          <w:p>
+            <w:r>
+              <w:t>Mọi HTML render trên Streamlit phải đi qua clean_html() để loại bỏ thụt đầu dòng. Khoảng trắng đầu dòng khiến Streamlit render thành code block thay vì HTML.</w:t>
+            </w:r>
+          </w:p>
+        </w:tc>
+      </w:tr>
+      <w:tr>
+        <w:tc>
+          <w:tcPr>
+            <w:tcW w:type="dxa" w:w="4703"/>
+          </w:tcPr>
+          <w:p>
+            <w:r>
+              <w:t>Python 3.13 cho Streamlit</w:t>
+            </w:r>
+          </w:p>
+        </w:tc>
+        <w:tc>
+          <w:tcPr>
+            <w:tcW w:type="dxa" w:w="4703"/>
+          </w:tcPr>
+          <w:p>
+            <w:r>
+              <w:t>Streamlit App chạy trên Python 3.13 (gọi python3.13 -m streamlit). Python 3.14 chưa hỗ trợ đầy đủ các thư viện Streamlit/Plotly.</w:t>
+            </w:r>
+          </w:p>
+        </w:tc>
+      </w:tr>
+      <w:tr>
+        <w:tc>
+          <w:tcPr>
+            <w:tcW w:type="dxa" w:w="4703"/>
+          </w:tcPr>
+          <w:p>
+            <w:r>
+              <w:t>_get_credentials() backward-compatible</w:t>
+            </w:r>
+          </w:p>
+        </w:tc>
+        <w:tc>
+          <w:tcPr>
+            <w:tcW w:type="dxa" w:w="4703"/>
+          </w:tcPr>
+          <w:p>
+            <w:r>
+              <w:t>Hàm này thử st.secrets trước (cloud), fallback về file local. Mọi hàm kết nối Google Sheets phải gọi _get_credentials() thay vì trực tiếp from_service_account_file().</w:t>
+            </w:r>
+          </w:p>
+        </w:tc>
+      </w:tr>
+      <w:tr>
+        <w:tc>
+          <w:tcPr>
+            <w:tcW w:type="dxa" w:w="4703"/>
+          </w:tcPr>
+          <w:p>
+            <w:r>
+              <w:t>Streamlit Cloud config</w:t>
+            </w:r>
+          </w:p>
+        </w:tc>
+        <w:tc>
+          <w:tcPr>
+            <w:tcW w:type="dxa" w:w="4703"/>
+          </w:tcPr>
+          <w:p>
+            <w:r>
+              <w:t>Thay đổi sale team, remind days vẫn phải qua tracker.py trên máy tính → commit config.json → push. Streamlit Cloud sẽ tự deploy lại và đọc config mới.</w:t>
+            </w:r>
+          </w:p>
+        </w:tc>
+      </w:tr>
+    </w:tbl>
+    <w:p>
+      <w:pPr>
+        <w:pStyle w:val="Heading2"/>
+      </w:pPr>
+      <w:r>
+        <w:rPr>
+          <w:color w:val="0D47A1"/>
+        </w:rPr>
+        <w:t>9.6  Lỗi Thường Gặp (Phiên 22-23)</w:t>
+      </w:r>
+    </w:p>
+    <w:tbl>
+      <w:tblPr>
+        <w:tblStyle w:val="TableGrid"/>
+        <w:tblW w:type="auto" w:w="0"/>
+        <w:tblLook w:firstColumn="1" w:firstRow="1" w:lastColumn="0" w:lastRow="0" w:noHBand="0" w:noVBand="1" w:val="04A0"/>
+      </w:tblPr>
+      <w:tblGrid>
+        <w:gridCol w:w="3135"/>
+        <w:gridCol w:w="3135"/>
+        <w:gridCol w:w="3135"/>
+      </w:tblGrid>
+      <w:tr>
+        <w:tc>
+          <w:tcPr>
+            <w:tcW w:type="dxa" w:w="3135"/>
+          </w:tcPr>
+          <w:p>
+            <w:r>
+              <w:rPr>
+                <w:b/>
+              </w:rPr>
+              <w:t>Lỗi</w:t>
+            </w:r>
+          </w:p>
+        </w:tc>
+        <w:tc>
+          <w:tcPr>
+            <w:tcW w:type="dxa" w:w="3135"/>
+          </w:tcPr>
+          <w:p>
+            <w:r>
+              <w:rPr>
+                <w:b/>
+              </w:rPr>
+              <w:t>Nguyên nhân</w:t>
+            </w:r>
+          </w:p>
+        </w:tc>
+        <w:tc>
+          <w:tcPr>
+            <w:tcW w:type="dxa" w:w="3135"/>
+          </w:tcPr>
+          <w:p>
+            <w:r>
+              <w:rPr>
+                <w:b/>
+              </w:rPr>
+              <w:t>Cách fix</w:t>
+            </w:r>
+          </w:p>
+        </w:tc>
+      </w:tr>
+      <w:tr>
+        <w:tc>
+          <w:tcPr>
+            <w:tcW w:type="dxa" w:w="3135"/>
+          </w:tcPr>
+          <w:p>
+            <w:r>
+              <w:t>APIError 429 RESOURCE_EXHAUSTED</w:t>
+            </w:r>
+          </w:p>
+        </w:tc>
+        <w:tc>
+          <w:tcPr>
+            <w:tcW w:type="dxa" w:w="3135"/>
+          </w:tcPr>
+          <w:p>
+            <w:r>
+              <w:t>Gọi Google Sheets API quá nhiều lần liên tiếp</w:t>
+            </w:r>
+          </w:p>
+        </w:tc>
+        <w:tc>
+          <w:tcPr>
+            <w:tcW w:type="dxa" w:w="3135"/>
+          </w:tcPr>
+          <w:p>
+            <w:r>
+              <w:t>@retry_api_call decorator tự ngủ và thử lại với thời gian tăng dần (2s, 4s, 8s...)</w:t>
+            </w:r>
+          </w:p>
+        </w:tc>
+      </w:tr>
+      <w:tr>
+        <w:tc>
+          <w:tcPr>
+            <w:tcW w:type="dxa" w:w="3135"/>
+          </w:tcPr>
+          <w:p>
+            <w:r>
+              <w:t>SĐT mất số 0 khi update/save</w:t>
+            </w:r>
+          </w:p>
+        </w:tc>
+        <w:tc>
+          <w:tcPr>
+            <w:tcW w:type="dxa" w:w="3135"/>
+          </w:tcPr>
+          <w:p>
+            <w:r>
+              <w:t>value_input_option mặc định USER_ENTERED → Sheets parse như số học</w:t>
+            </w:r>
+          </w:p>
+        </w:tc>
+        <w:tc>
+          <w:tcPr>
+            <w:tcW w:type="dxa" w:w="3135"/>
+          </w:tcPr>
+          <w:p>
+            <w:r>
+              <w:t>Đổi thành RAW trong append_row(), update_row(), append_staging_row()</w:t>
+            </w:r>
+          </w:p>
+        </w:tc>
+      </w:tr>
+      <w:tr>
+        <w:tc>
+          <w:tcPr>
+            <w:tcW w:type="dxa" w:w="3135"/>
+          </w:tcPr>
+          <w:p>
+            <w:r>
+              <w:t>Streamlit hiển thị code thô thay vì bảng HTML</w:t>
+            </w:r>
+          </w:p>
+        </w:tc>
+        <w:tc>
+          <w:tcPr>
+            <w:tcW w:type="dxa" w:w="3135"/>
+          </w:tcPr>
+          <w:p>
+            <w:r>
+              <w:t>Khoảng trắng đầu dòng (indentation) → Streamlit render thành Markdown code block</w:t>
+            </w:r>
+          </w:p>
+        </w:tc>
+        <w:tc>
+          <w:tcPr>
+            <w:tcW w:type="dxa" w:w="3135"/>
+          </w:tcPr>
+          <w:p>
+            <w:r>
+              <w:t>Dùng hàm clean_html() lọc line.lstrip() trước khi truyền vào st.markdown()</w:t>
+            </w:r>
+          </w:p>
+        </w:tc>
+      </w:tr>
+      <w:tr>
+        <w:tc>
+          <w:tcPr>
+            <w:tcW w:type="dxa" w:w="3135"/>
+          </w:tcPr>
+          <w:p>
+            <w:r>
+              <w:t>'This repository does not exist' trên Streamlit</w:t>
+            </w:r>
+          </w:p>
+        </w:tc>
+        <w:tc>
+          <w:tcPr>
+            <w:tcW w:type="dxa" w:w="3135"/>
+          </w:tcPr>
+          <w:p>
+            <w:r>
+              <w:t>Repo private; Streamlit OAuth chỉ có quyền public_repo</w:t>
+            </w:r>
+          </w:p>
+        </w:tc>
+        <w:tc>
+          <w:tcPr>
+            <w:tcW w:type="dxa" w:w="3135"/>
+          </w:tcPr>
+          <w:p>
+            <w:r>
+              <w:t>Đổi repo thành public (an toàn vì credentials đã gitignored)</w:t>
+            </w:r>
+          </w:p>
+        </w:tc>
+      </w:tr>
+      <w:tr>
+        <w:tc>
+          <w:tcPr>
+            <w:tcW w:type="dxa" w:w="3135"/>
+          </w:tcPr>
+          <w:p>
+            <w:r>
+              <w:t>Git không nhận lệnh trong PowerShell</w:t>
+            </w:r>
+          </w:p>
+        </w:tc>
+        <w:tc>
+          <w:tcPr>
+            <w:tcW w:type="dxa" w:w="3135"/>
+          </w:tcPr>
+          <w:p>
+            <w:r>
+              <w:t>PATH không refresh sau khi cài Git for Windows trong phiên PowerShell hiện tại</w:t>
+            </w:r>
+          </w:p>
+        </w:tc>
+        <w:tc>
+          <w:tcPr>
+            <w:tcW w:type="dxa" w:w="3135"/>
+          </w:tcPr>
+          <w:p>
+            <w:r>
+              <w:t>Dùng đường dẫn đầy đủ: C:\Program Files\Git\cmd\git.exe</w:t>
+            </w:r>
+          </w:p>
+        </w:tc>
+      </w:tr>
+      <w:tr>
+        <w:tc>
+          <w:tcPr>
+            <w:tcW w:type="dxa" w:w="3135"/>
+          </w:tcPr>
+          <w:p>
+            <w:r>
+              <w:t>Chrome iPhone không có 'Thêm vào màn hình chính'</w:t>
+            </w:r>
+          </w:p>
+        </w:tc>
+        <w:tc>
+          <w:tcPr>
+            <w:tcW w:type="dxa" w:w="3135"/>
+          </w:tcPr>
+          <w:p>
+            <w:r>
+              <w:t>Giới hạn của Apple/Chrome iOS — không phải lỗi</w:t>
+            </w:r>
+          </w:p>
+        </w:tc>
+        <w:tc>
+          <w:tcPr>
+            <w:tcW w:type="dxa" w:w="3135"/>
+          </w:tcPr>
+          <w:p>
+            <w:r>
+              <w:t>Bắt buộc dùng Safari trên iPhone/iPad</w:t>
+            </w:r>
+          </w:p>
+        </w:tc>
+      </w:tr>
+    </w:tbl>
     <w:sectPr>
       <w:pgSz w:w="12240" w:h="15840"/>
       <w:pgMar w:top="1134" w:right="1417" w:bottom="1134" w:left="1417" w:header="720" w:footer="720" w:gutter="0"/>

</xml_diff>